<commit_message>
Rebuild figures, use the PRISMA template with 76 studies, add TIFF and PNG figure files
</commit_message>
<xml_diff>
--- a/docs/assets/files/Manuscript.docx
+++ b/docs/assets/files/Manuscript.docx
@@ -5573,7 +5573,7 @@
           <w:i w:val="0"/>
           <w:sz w:val="24"/>
         </w:rPr>
-        <w:t>PRISMA 2020 flow diagram of study identification, screening, and inclusion, with databases and the preprint server on the left and other methods on the right. CENTRAL, Cochrane Central Register of Controlled Trials.</w:t>
+        <w:t>PRISMA 2020 flow diagram of study identification, screening, and inclusion, with databases and the preprint server on the left and other methods on the right. Other methods are Google Scholar, citation searching, and sources supplied by the clinical team.</w:t>
       </w:r>
     </w:p>
     <w:p>
@@ -5593,7 +5593,7 @@
           <w:i w:val="0"/>
           <w:sz w:val="24"/>
         </w:rPr>
-        <w:t>Evidence map of domains against tumor category. Bubble size is the number of core studies and shading is the share of graded studies at Oxford Centre for Evidence-Based Medicine level 2. Trial protocols are excluded.</w:t>
+        <w:t>Evidence map of domains against tumor category. Bubble size is the number of core studies and shading is the share of graded studies at Oxford Centre for Evidence-Based Medicine level 2. Trial protocols are excluded from the bubbles but counted in the column totals.</w:t>
       </w:r>
     </w:p>
     <w:p>

</xml_diff>